<commit_message>
Refine engineering closure wording
</commit_message>
<xml_diff>
--- a/docx/word/13_轴承寿命预测与故障诊断系统_结题报告_zyj.docx
+++ b/docx/word/13_轴承寿命预测与故障诊断系统_结题报告_zyj.docx
@@ -177,7 +177,7 @@
         <w:pStyle w:val="FirstParagraph"/>
       </w:pPr>
       <w:r>
-        <w:t xml:space="preserve">本项目面向轴承预测性维护课程场景，建设一个可运行、可测试、可复查的轴承寿命预测与故障诊断系统。系统围绕两个公开数据集展开：PHM2012 用于剩余寿命 RUL 回归复现，XJTU-SY 用于健康/故障诊断复现。项目重点不是搭建在线工业平台，而是在本地工程环境中形成从数据接入、特征工程、模型训练、指标评估到文档交付的闭环证据链。</w:t>
+        <w:t xml:space="preserve">本项目面向轴承预测性维护课程场景，建设一个可运行、可测试、可复查的轴承寿命预测与故障诊断系统。系统围绕两个公开数据集展开：PHM2012 用于剩余寿命 RUL 回归复现，XJTU-SY 用于健康/故障诊断复现。项目重点不是搭建在线工业平台，而是在本地工程环境中形成从数据接入、特征工程、模型训练到评估输出的闭环证据链。</w:t>
       </w:r>
     </w:p>
     <w:p>
@@ -545,7 +545,7 @@
               <w:jc w:val="left"/>
             </w:pPr>
             <w:r>
-              <w:t xml:space="preserve">文档交付</w:t>
+              <w:t xml:space="preserve">交付材料</w:t>
             </w:r>
           </w:p>
         </w:tc>

</xml_diff>